<commit_message>
feat: update report exports and local database
</commit_message>
<xml_diff>
--- a/backend/templates/bulanan-perikanan.docx
+++ b/backend/templates/bulanan-perikanan.docx
@@ -1,6 +1,6 @@
 
 <file path=word/document.xml><?xml version="1.0" encoding="utf-8"?>
-<w:document xmlns:wpc="http://schemas.microsoft.com/office/word/2010/wordprocessingCanvas" xmlns:cx="http://schemas.microsoft.com/office/drawing/2014/chartex" xmlns:cx1="http://schemas.microsoft.com/office/drawing/2015/9/8/chartex" xmlns:cx2="http://schemas.microsoft.com/office/drawing/2015/10/21/chartex" xmlns:cx3="http://schemas.microsoft.com/office/drawing/2016/5/9/chartex" xmlns:cx4="http://schemas.microsoft.com/office/drawing/2016/5/10/chartex" xmlns:cx5="http://schemas.microsoft.com/office/drawing/2016/5/11/chartex" xmlns:cx6="http://schemas.microsoft.com/office/drawing/2016/5/12/chartex" xmlns:cx7="http://schemas.microsoft.com/office/drawing/2016/5/13/chartex" xmlns:cx8="http://schemas.microsoft.com/office/drawing/2016/5/14/chartex" xmlns:mc="http://schemas.openxmlformats.org/markup-compatibility/2006" xmlns:aink="http://schemas.microsoft.com/office/drawing/2016/ink" xmlns:am3d="http://schemas.microsoft.com/office/drawing/2017/model3d" xmlns:o="urn:schemas-microsoft-com:office:office" xmlns:oel="http://schemas.microsoft.com/office/2019/extlst" xmlns:r="http://schemas.openxmlformats.org/officeDocument/2006/relationships" xmlns:m="http://schemas.openxmlformats.org/officeDocument/2006/math" xmlns:v="urn:schemas-microsoft-com:vml" xmlns:wp14="http://schemas.microsoft.com/office/word/2010/wordprocessingDrawing" xmlns:wp="http://schemas.openxmlformats.org/drawingml/2006/wordprocessingDrawing" xmlns:w10="urn:schemas-microsoft-com:office:word" xmlns:w="http://schemas.openxmlformats.org/wordprocessingml/2006/main" xmlns:w14="http://schemas.microsoft.com/office/word/2010/wordml" xmlns:w15="http://schemas.microsoft.com/office/word/2012/wordml" xmlns:w16cex="http://schemas.microsoft.com/office/word/2018/wordml/cex" xmlns:w16cid="http://schemas.microsoft.com/office/word/2016/wordml/cid" xmlns:w16="http://schemas.microsoft.com/office/word/2018/wordml" xmlns:w16du="http://schemas.microsoft.com/office/word/2023/wordml/word16du" xmlns:w16sdtdh="http://schemas.microsoft.com/office/word/2020/wordml/sdtdatahash" xmlns:w16se="http://schemas.microsoft.com/office/word/2015/wordml/symex" xmlns:wpg="http://schemas.microsoft.com/office/word/2010/wordprocessingGroup" xmlns:wpi="http://schemas.microsoft.com/office/word/2010/wordprocessingInk" xmlns:wne="http://schemas.microsoft.com/office/word/2006/wordml" xmlns:wps="http://schemas.microsoft.com/office/word/2010/wordprocessingShape" mc:Ignorable="w14 w15 w16se w16cid w16 w16cex w16sdtdh w16du wp14">
+<w:document xmlns:wpc="http://schemas.microsoft.com/office/word/2010/wordprocessingCanvas" xmlns:cx="http://schemas.microsoft.com/office/drawing/2014/chartex" xmlns:cx1="http://schemas.microsoft.com/office/drawing/2015/9/8/chartex" xmlns:cx2="http://schemas.microsoft.com/office/drawing/2015/10/21/chartex" xmlns:cx3="http://schemas.microsoft.com/office/drawing/2016/5/9/chartex" xmlns:cx4="http://schemas.microsoft.com/office/drawing/2016/5/10/chartex" xmlns:cx5="http://schemas.microsoft.com/office/drawing/2016/5/11/chartex" xmlns:cx6="http://schemas.microsoft.com/office/drawing/2016/5/12/chartex" xmlns:cx7="http://schemas.microsoft.com/office/drawing/2016/5/13/chartex" xmlns:cx8="http://schemas.microsoft.com/office/drawing/2016/5/14/chartex" xmlns:mc="http://schemas.openxmlformats.org/markup-compatibility/2006" xmlns:aink="http://schemas.microsoft.com/office/drawing/2016/ink" xmlns:am3d="http://schemas.microsoft.com/office/drawing/2017/model3d" xmlns:o="urn:schemas-microsoft-com:office:office" xmlns:oel="http://schemas.microsoft.com/office/2019/extlst" xmlns:r="http://schemas.openxmlformats.org/officeDocument/2006/relationships" xmlns:m="http://schemas.openxmlformats.org/officeDocument/2006/math" xmlns:v="urn:schemas-microsoft-com:vml" xmlns:wp14="http://schemas.microsoft.com/office/word/2010/wordprocessingDrawing" xmlns:wp="http://schemas.openxmlformats.org/drawingml/2006/wordprocessingDrawing" xmlns:w10="urn:schemas-microsoft-com:office:word" xmlns:w="http://schemas.openxmlformats.org/wordprocessingml/2006/main" xmlns:w14="http://schemas.microsoft.com/office/word/2010/wordml" xmlns:w15="http://schemas.microsoft.com/office/word/2012/wordml" xmlns:w16cex="http://schemas.microsoft.com/office/word/2018/wordml/cex" xmlns:w16cid="http://schemas.microsoft.com/office/word/2016/wordml/cid" xmlns:w16="http://schemas.microsoft.com/office/word/2018/wordml" xmlns:w16du="http://schemas.microsoft.com/office/word/2023/wordml/word16du" xmlns:w16sdtdh="http://schemas.microsoft.com/office/word/2020/wordml/sdtdatahash" xmlns:w16sdtfl="http://schemas.microsoft.com/office/word/2024/wordml/sdtformatlock" xmlns:w16se="http://schemas.microsoft.com/office/word/2015/wordml/symex" xmlns:wpg="http://schemas.microsoft.com/office/word/2010/wordprocessingGroup" xmlns:wpi="http://schemas.microsoft.com/office/word/2010/wordprocessingInk" xmlns:wne="http://schemas.microsoft.com/office/word/2006/wordml" xmlns:wps="http://schemas.microsoft.com/office/word/2010/wordprocessingShape" mc:Ignorable="w14 w15 w16se w16cid w16 w16cex w16sdtdh w16sdtfl w16du wp14">
   <w:body>
     <w:p>
       <w:pPr>
@@ -163,7 +163,7 @@
           <w:szCs w:val="24"/>
           <w:lang w:val="id-ID"/>
         </w:rPr>
-        <w:t>JANUARI</w:t>
+        <w:t>MEI</w:t>
       </w:r>
       <w:r>
         <w:rPr>
@@ -314,16 +314,7 @@
           <w:szCs w:val="24"/>
           <w:lang w:val="id-ID"/>
         </w:rPr>
-        <w:t>3</w:t>
-      </w:r>
-      <w:r>
-        <w:rPr>
-          <w:rFonts w:ascii="Arial" w:hAnsi="Arial" w:cs="Arial"/>
-          <w:sz w:val="24"/>
-          <w:szCs w:val="24"/>
-          <w:lang w:val="id-ID"/>
-        </w:rPr>
-        <w:t>0</w:t>
+        <w:t>29</w:t>
       </w:r>
       <w:r>
         <w:rPr>
@@ -341,7 +332,7 @@
           <w:szCs w:val="24"/>
           <w:lang w:val="id-ID"/>
         </w:rPr>
-        <w:t>Januari</w:t>
+        <w:t>Mei</w:t>
       </w:r>
       <w:r>
         <w:rPr>
@@ -820,13 +811,32 @@
                 <w:szCs w:val="20"/>
               </w:rPr>
             </w:pPr>
+            <w:proofErr w:type="spellStart"/>
             <w:r>
               <w:rPr>
                 <w:rFonts w:ascii="Arial" w:hAnsi="Arial" w:cs="Arial"/>
                 <w:sz w:val="20"/>
                 <w:szCs w:val="20"/>
               </w:rPr>
-              <w:t>Perkara P</w:t>
+              <w:t>Perkara</w:t>
+            </w:r>
+            <w:proofErr w:type="spellEnd"/>
+            <w:r>
+              <w:rPr>
+                <w:rFonts w:ascii="Arial" w:hAnsi="Arial" w:cs="Arial"/>
+                <w:sz w:val="20"/>
+                <w:szCs w:val="20"/>
+              </w:rPr>
+              <w:t xml:space="preserve"> </w:t>
+            </w:r>
+            <w:proofErr w:type="spellStart"/>
+            <w:r>
+              <w:rPr>
+                <w:rFonts w:ascii="Arial" w:hAnsi="Arial" w:cs="Arial"/>
+                <w:sz w:val="20"/>
+                <w:szCs w:val="20"/>
+              </w:rPr>
+              <w:t>P</w:t>
             </w:r>
             <w:r>
               <w:rPr>
@@ -836,6 +846,7 @@
               </w:rPr>
               <w:t>erikanan</w:t>
             </w:r>
+            <w:proofErr w:type="spellEnd"/>
           </w:p>
           <w:p>
             <w:pPr>
@@ -910,7 +921,6 @@
                 <w:rFonts w:ascii="Arial" w:hAnsi="Arial" w:cs="Arial"/>
                 <w:sz w:val="20"/>
                 <w:szCs w:val="20"/>
-                <w:lang w:val="id-ID"/>
               </w:rPr>
             </w:pPr>
             <w:r>
@@ -939,9 +949,8 @@
               <w:jc w:val="center"/>
               <w:rPr>
                 <w:rFonts w:ascii="Arial" w:hAnsi="Arial" w:cs="Arial"/>
-                <w:sz w:val="24"/>
-                <w:szCs w:val="24"/>
-                <w:lang w:val="id-ID"/>
+                <w:sz w:val="20"/>
+                <w:szCs w:val="20"/>
               </w:rPr>
             </w:pPr>
             <w:r>
@@ -970,9 +979,8 @@
               <w:jc w:val="center"/>
               <w:rPr>
                 <w:rFonts w:ascii="Arial" w:hAnsi="Arial" w:cs="Arial"/>
-                <w:sz w:val="24"/>
-                <w:szCs w:val="24"/>
-                <w:lang w:val="id-ID"/>
+                <w:sz w:val="20"/>
+                <w:szCs w:val="20"/>
               </w:rPr>
             </w:pPr>
             <w:r>
@@ -987,9 +995,6 @@
         </w:tc>
       </w:tr>
       <w:tr>
-        <w:trPr>
-          <w:trHeight w:val="283"/>
-        </w:trPr>
         <w:tc>
           <w:tcPr>
             <w:tcW w:w="308" w:type="pct"/>
@@ -1049,8 +1054,18 @@
                 <w:sz w:val="20"/>
                 <w:szCs w:val="20"/>
               </w:rPr>
-              <w:t>Berita Acara Sidang</w:t>
+              <w:t xml:space="preserve">Berita Acara </w:t>
             </w:r>
+            <w:proofErr w:type="spellStart"/>
+            <w:r>
+              <w:rPr>
+                <w:rFonts w:ascii="Arial" w:hAnsi="Arial" w:cs="Arial"/>
+                <w:sz w:val="20"/>
+                <w:szCs w:val="20"/>
+              </w:rPr>
+              <w:t>Sidang</w:t>
+            </w:r>
+            <w:proofErr w:type="spellEnd"/>
           </w:p>
           <w:p>
             <w:pPr>
@@ -1059,7 +1074,7 @@
                 <w:tab w:val="left" w:pos="3686"/>
                 <w:tab w:val="left" w:leader="dot" w:pos="5245"/>
               </w:tabs>
-              <w:ind w:left="20" w:firstLine="0"/>
+              <w:ind w:firstLine="0"/>
               <w:jc w:val="center"/>
               <w:rPr>
                 <w:rFonts w:ascii="Arial" w:hAnsi="Arial" w:cs="Arial"/>
@@ -1886,6 +1901,7 @@
         </w:rPr>
         <w:t xml:space="preserve">       </w:t>
       </w:r>
+      <w:proofErr w:type="spellStart"/>
       <w:r>
         <w:rPr>
           <w:rFonts w:ascii="Arial" w:hAnsi="Arial" w:cs="Arial"/>
@@ -1902,6 +1918,7 @@
         </w:rPr>
         <w:t>t</w:t>
       </w:r>
+      <w:proofErr w:type="spellEnd"/>
       <w:r>
         <w:rPr>
           <w:rFonts w:ascii="Arial" w:hAnsi="Arial" w:cs="Arial"/>
@@ -1910,21 +1927,40 @@
         </w:rPr>
         <w:t xml:space="preserve"> </w:t>
       </w:r>
-      <w:r>
-        <w:rPr>
-          <w:rFonts w:ascii="Arial" w:hAnsi="Arial" w:cs="Arial"/>
-          <w:sz w:val="24"/>
-          <w:szCs w:val="24"/>
-        </w:rPr>
-        <w:t>Panitera Muda</w:t>
-      </w:r>
-      <w:r>
-        <w:rPr>
-          <w:rFonts w:ascii="Arial" w:hAnsi="Arial" w:cs="Arial"/>
-          <w:sz w:val="24"/>
-          <w:szCs w:val="24"/>
-        </w:rPr>
-        <w:t xml:space="preserve"> P</w:t>
+      <w:proofErr w:type="spellStart"/>
+      <w:r>
+        <w:rPr>
+          <w:rFonts w:ascii="Arial" w:hAnsi="Arial" w:cs="Arial"/>
+          <w:sz w:val="24"/>
+          <w:szCs w:val="24"/>
+        </w:rPr>
+        <w:t>Panitera</w:t>
+      </w:r>
+      <w:proofErr w:type="spellEnd"/>
+      <w:r>
+        <w:rPr>
+          <w:rFonts w:ascii="Arial" w:hAnsi="Arial" w:cs="Arial"/>
+          <w:sz w:val="24"/>
+          <w:szCs w:val="24"/>
+        </w:rPr>
+        <w:t xml:space="preserve"> Muda</w:t>
+      </w:r>
+      <w:r>
+        <w:rPr>
+          <w:rFonts w:ascii="Arial" w:hAnsi="Arial" w:cs="Arial"/>
+          <w:sz w:val="24"/>
+          <w:szCs w:val="24"/>
+        </w:rPr>
+        <w:t xml:space="preserve"> </w:t>
+      </w:r>
+      <w:proofErr w:type="spellStart"/>
+      <w:r>
+        <w:rPr>
+          <w:rFonts w:ascii="Arial" w:hAnsi="Arial" w:cs="Arial"/>
+          <w:sz w:val="24"/>
+          <w:szCs w:val="24"/>
+        </w:rPr>
+        <w:t>P</w:t>
       </w:r>
       <w:r>
         <w:rPr>
@@ -1934,6 +1970,7 @@
         </w:rPr>
         <w:t>erikanan</w:t>
       </w:r>
+      <w:proofErr w:type="spellEnd"/>
     </w:p>
     <w:p>
       <w:pPr>
@@ -2200,6 +2237,15 @@
           <w:szCs w:val="24"/>
           <w:lang w:val="id-ID"/>
         </w:rPr>
+        <w:t xml:space="preserve">Wakil </w:t>
+      </w:r>
+      <w:r>
+        <w:rPr>
+          <w:rFonts w:ascii="Arial" w:hAnsi="Arial" w:cs="Arial"/>
+          <w:sz w:val="24"/>
+          <w:szCs w:val="24"/>
+          <w:lang w:val="id-ID"/>
+        </w:rPr>
         <w:t>Ketua Pengadilan Negeri Natuna</w:t>
       </w:r>
     </w:p>
@@ -2271,7 +2317,7 @@
           <w:sz w:val="24"/>
           <w:szCs w:val="24"/>
         </w:rPr>
-        <w:t>Lodewyk Ivandrie Simanjuntak</w:t>
+        <w:t>Joko Ciptanto</w:t>
       </w:r>
       <w:r>
         <w:rPr>
@@ -2283,11 +2329,11 @@
       </w:r>
     </w:p>
     <w:sectPr>
-      <w:headerReference w:type="first" r:id="rId8"/>
+      <w:headerReference w:type="default" r:id="rId8"/>
+      <w:headerReference w:type="first" r:id="rId9"/>
       <w:pgSz w:w="12240" w:h="20160" w:code="5"/>
       <w:pgMar w:top="1560" w:right="1440" w:bottom="709" w:left="1440" w:header="567" w:footer="709" w:gutter="0"/>
       <w:cols w:space="708"/>
-      <w:titlePg/>
       <w:docGrid w:linePitch="360"/>
     </w:sectPr>
   </w:body>
@@ -2295,7 +2341,7 @@
 </file>
 
 <file path=word/endnotes.xml><?xml version="1.0" encoding="utf-8"?>
-<w:endnotes xmlns:wpc="http://schemas.microsoft.com/office/word/2010/wordprocessingCanvas" xmlns:cx="http://schemas.microsoft.com/office/drawing/2014/chartex" xmlns:cx1="http://schemas.microsoft.com/office/drawing/2015/9/8/chartex" xmlns:cx2="http://schemas.microsoft.com/office/drawing/2015/10/21/chartex" xmlns:cx3="http://schemas.microsoft.com/office/drawing/2016/5/9/chartex" xmlns:cx4="http://schemas.microsoft.com/office/drawing/2016/5/10/chartex" xmlns:cx5="http://schemas.microsoft.com/office/drawing/2016/5/11/chartex" xmlns:cx6="http://schemas.microsoft.com/office/drawing/2016/5/12/chartex" xmlns:cx7="http://schemas.microsoft.com/office/drawing/2016/5/13/chartex" xmlns:cx8="http://schemas.microsoft.com/office/drawing/2016/5/14/chartex" xmlns:mc="http://schemas.openxmlformats.org/markup-compatibility/2006" xmlns:aink="http://schemas.microsoft.com/office/drawing/2016/ink" xmlns:am3d="http://schemas.microsoft.com/office/drawing/2017/model3d" xmlns:o="urn:schemas-microsoft-com:office:office" xmlns:oel="http://schemas.microsoft.com/office/2019/extlst" xmlns:r="http://schemas.openxmlformats.org/officeDocument/2006/relationships" xmlns:m="http://schemas.openxmlformats.org/officeDocument/2006/math" xmlns:v="urn:schemas-microsoft-com:vml" xmlns:wp14="http://schemas.microsoft.com/office/word/2010/wordprocessingDrawing" xmlns:wp="http://schemas.openxmlformats.org/drawingml/2006/wordprocessingDrawing" xmlns:w10="urn:schemas-microsoft-com:office:word" xmlns:w="http://schemas.openxmlformats.org/wordprocessingml/2006/main" xmlns:w14="http://schemas.microsoft.com/office/word/2010/wordml" xmlns:w15="http://schemas.microsoft.com/office/word/2012/wordml" xmlns:w16cex="http://schemas.microsoft.com/office/word/2018/wordml/cex" xmlns:w16cid="http://schemas.microsoft.com/office/word/2016/wordml/cid" xmlns:w16="http://schemas.microsoft.com/office/word/2018/wordml" xmlns:w16du="http://schemas.microsoft.com/office/word/2023/wordml/word16du" xmlns:w16sdtdh="http://schemas.microsoft.com/office/word/2020/wordml/sdtdatahash" xmlns:w16se="http://schemas.microsoft.com/office/word/2015/wordml/symex" xmlns:wpg="http://schemas.microsoft.com/office/word/2010/wordprocessingGroup" xmlns:wpi="http://schemas.microsoft.com/office/word/2010/wordprocessingInk" xmlns:wne="http://schemas.microsoft.com/office/word/2006/wordml" xmlns:wps="http://schemas.microsoft.com/office/word/2010/wordprocessingShape" mc:Ignorable="w14 w15 w16se w16cid w16 w16cex w16sdtdh w16du wp14">
+<w:endnotes xmlns:wpc="http://schemas.microsoft.com/office/word/2010/wordprocessingCanvas" xmlns:cx="http://schemas.microsoft.com/office/drawing/2014/chartex" xmlns:cx1="http://schemas.microsoft.com/office/drawing/2015/9/8/chartex" xmlns:cx2="http://schemas.microsoft.com/office/drawing/2015/10/21/chartex" xmlns:cx3="http://schemas.microsoft.com/office/drawing/2016/5/9/chartex" xmlns:cx4="http://schemas.microsoft.com/office/drawing/2016/5/10/chartex" xmlns:cx5="http://schemas.microsoft.com/office/drawing/2016/5/11/chartex" xmlns:cx6="http://schemas.microsoft.com/office/drawing/2016/5/12/chartex" xmlns:cx7="http://schemas.microsoft.com/office/drawing/2016/5/13/chartex" xmlns:cx8="http://schemas.microsoft.com/office/drawing/2016/5/14/chartex" xmlns:mc="http://schemas.openxmlformats.org/markup-compatibility/2006" xmlns:aink="http://schemas.microsoft.com/office/drawing/2016/ink" xmlns:am3d="http://schemas.microsoft.com/office/drawing/2017/model3d" xmlns:o="urn:schemas-microsoft-com:office:office" xmlns:oel="http://schemas.microsoft.com/office/2019/extlst" xmlns:r="http://schemas.openxmlformats.org/officeDocument/2006/relationships" xmlns:m="http://schemas.openxmlformats.org/officeDocument/2006/math" xmlns:v="urn:schemas-microsoft-com:vml" xmlns:wp14="http://schemas.microsoft.com/office/word/2010/wordprocessingDrawing" xmlns:wp="http://schemas.openxmlformats.org/drawingml/2006/wordprocessingDrawing" xmlns:w10="urn:schemas-microsoft-com:office:word" xmlns:w="http://schemas.openxmlformats.org/wordprocessingml/2006/main" xmlns:w14="http://schemas.microsoft.com/office/word/2010/wordml" xmlns:w15="http://schemas.microsoft.com/office/word/2012/wordml" xmlns:w16cex="http://schemas.microsoft.com/office/word/2018/wordml/cex" xmlns:w16cid="http://schemas.microsoft.com/office/word/2016/wordml/cid" xmlns:w16="http://schemas.microsoft.com/office/word/2018/wordml" xmlns:w16du="http://schemas.microsoft.com/office/word/2023/wordml/word16du" xmlns:w16sdtdh="http://schemas.microsoft.com/office/word/2020/wordml/sdtdatahash" xmlns:w16sdtfl="http://schemas.microsoft.com/office/word/2024/wordml/sdtformatlock" xmlns:w16se="http://schemas.microsoft.com/office/word/2015/wordml/symex" xmlns:wpg="http://schemas.microsoft.com/office/word/2010/wordprocessingGroup" xmlns:wpi="http://schemas.microsoft.com/office/word/2010/wordprocessingInk" xmlns:wne="http://schemas.microsoft.com/office/word/2006/wordml" xmlns:wps="http://schemas.microsoft.com/office/word/2010/wordprocessingShape" mc:Ignorable="w14 w15 w16se w16cid w16 w16cex w16sdtdh w16sdtfl w16du wp14">
   <w:endnote w:type="separator" w:id="-1">
     <w:p>
       <w:r>
@@ -2314,7 +2360,7 @@
 </file>
 
 <file path=word/footnotes.xml><?xml version="1.0" encoding="utf-8"?>
-<w:footnotes xmlns:wpc="http://schemas.microsoft.com/office/word/2010/wordprocessingCanvas" xmlns:cx="http://schemas.microsoft.com/office/drawing/2014/chartex" xmlns:cx1="http://schemas.microsoft.com/office/drawing/2015/9/8/chartex" xmlns:cx2="http://schemas.microsoft.com/office/drawing/2015/10/21/chartex" xmlns:cx3="http://schemas.microsoft.com/office/drawing/2016/5/9/chartex" xmlns:cx4="http://schemas.microsoft.com/office/drawing/2016/5/10/chartex" xmlns:cx5="http://schemas.microsoft.com/office/drawing/2016/5/11/chartex" xmlns:cx6="http://schemas.microsoft.com/office/drawing/2016/5/12/chartex" xmlns:cx7="http://schemas.microsoft.com/office/drawing/2016/5/13/chartex" xmlns:cx8="http://schemas.microsoft.com/office/drawing/2016/5/14/chartex" xmlns:mc="http://schemas.openxmlformats.org/markup-compatibility/2006" xmlns:aink="http://schemas.microsoft.com/office/drawing/2016/ink" xmlns:am3d="http://schemas.microsoft.com/office/drawing/2017/model3d" xmlns:o="urn:schemas-microsoft-com:office:office" xmlns:oel="http://schemas.microsoft.com/office/2019/extlst" xmlns:r="http://schemas.openxmlformats.org/officeDocument/2006/relationships" xmlns:m="http://schemas.openxmlformats.org/officeDocument/2006/math" xmlns:v="urn:schemas-microsoft-com:vml" xmlns:wp14="http://schemas.microsoft.com/office/word/2010/wordprocessingDrawing" xmlns:wp="http://schemas.openxmlformats.org/drawingml/2006/wordprocessingDrawing" xmlns:w10="urn:schemas-microsoft-com:office:word" xmlns:w="http://schemas.openxmlformats.org/wordprocessingml/2006/main" xmlns:w14="http://schemas.microsoft.com/office/word/2010/wordml" xmlns:w15="http://schemas.microsoft.com/office/word/2012/wordml" xmlns:w16cex="http://schemas.microsoft.com/office/word/2018/wordml/cex" xmlns:w16cid="http://schemas.microsoft.com/office/word/2016/wordml/cid" xmlns:w16="http://schemas.microsoft.com/office/word/2018/wordml" xmlns:w16du="http://schemas.microsoft.com/office/word/2023/wordml/word16du" xmlns:w16sdtdh="http://schemas.microsoft.com/office/word/2020/wordml/sdtdatahash" xmlns:w16se="http://schemas.microsoft.com/office/word/2015/wordml/symex" xmlns:wpg="http://schemas.microsoft.com/office/word/2010/wordprocessingGroup" xmlns:wpi="http://schemas.microsoft.com/office/word/2010/wordprocessingInk" xmlns:wne="http://schemas.microsoft.com/office/word/2006/wordml" xmlns:wps="http://schemas.microsoft.com/office/word/2010/wordprocessingShape" mc:Ignorable="w14 w15 w16se w16cid w16 w16cex w16sdtdh w16du wp14">
+<w:footnotes xmlns:wpc="http://schemas.microsoft.com/office/word/2010/wordprocessingCanvas" xmlns:cx="http://schemas.microsoft.com/office/drawing/2014/chartex" xmlns:cx1="http://schemas.microsoft.com/office/drawing/2015/9/8/chartex" xmlns:cx2="http://schemas.microsoft.com/office/drawing/2015/10/21/chartex" xmlns:cx3="http://schemas.microsoft.com/office/drawing/2016/5/9/chartex" xmlns:cx4="http://schemas.microsoft.com/office/drawing/2016/5/10/chartex" xmlns:cx5="http://schemas.microsoft.com/office/drawing/2016/5/11/chartex" xmlns:cx6="http://schemas.microsoft.com/office/drawing/2016/5/12/chartex" xmlns:cx7="http://schemas.microsoft.com/office/drawing/2016/5/13/chartex" xmlns:cx8="http://schemas.microsoft.com/office/drawing/2016/5/14/chartex" xmlns:mc="http://schemas.openxmlformats.org/markup-compatibility/2006" xmlns:aink="http://schemas.microsoft.com/office/drawing/2016/ink" xmlns:am3d="http://schemas.microsoft.com/office/drawing/2017/model3d" xmlns:o="urn:schemas-microsoft-com:office:office" xmlns:oel="http://schemas.microsoft.com/office/2019/extlst" xmlns:r="http://schemas.openxmlformats.org/officeDocument/2006/relationships" xmlns:m="http://schemas.openxmlformats.org/officeDocument/2006/math" xmlns:v="urn:schemas-microsoft-com:vml" xmlns:wp14="http://schemas.microsoft.com/office/word/2010/wordprocessingDrawing" xmlns:wp="http://schemas.openxmlformats.org/drawingml/2006/wordprocessingDrawing" xmlns:w10="urn:schemas-microsoft-com:office:word" xmlns:w="http://schemas.openxmlformats.org/wordprocessingml/2006/main" xmlns:w14="http://schemas.microsoft.com/office/word/2010/wordml" xmlns:w15="http://schemas.microsoft.com/office/word/2012/wordml" xmlns:w16cex="http://schemas.microsoft.com/office/word/2018/wordml/cex" xmlns:w16cid="http://schemas.microsoft.com/office/word/2016/wordml/cid" xmlns:w16="http://schemas.microsoft.com/office/word/2018/wordml" xmlns:w16du="http://schemas.microsoft.com/office/word/2023/wordml/word16du" xmlns:w16sdtdh="http://schemas.microsoft.com/office/word/2020/wordml/sdtdatahash" xmlns:w16sdtfl="http://schemas.microsoft.com/office/word/2024/wordml/sdtformatlock" xmlns:w16se="http://schemas.microsoft.com/office/word/2015/wordml/symex" xmlns:wpg="http://schemas.microsoft.com/office/word/2010/wordprocessingGroup" xmlns:wpi="http://schemas.microsoft.com/office/word/2010/wordprocessingInk" xmlns:wne="http://schemas.microsoft.com/office/word/2006/wordml" xmlns:wps="http://schemas.microsoft.com/office/word/2010/wordprocessingShape" mc:Ignorable="w14 w15 w16se w16cid w16 w16cex w16sdtdh w16sdtfl w16du wp14">
   <w:footnote w:type="separator" w:id="-1">
     <w:p>
       <w:r>
@@ -2333,7 +2379,440 @@
 </file>
 
 <file path=word/header1.xml><?xml version="1.0" encoding="utf-8"?>
-<w:hdr xmlns:wpc="http://schemas.microsoft.com/office/word/2010/wordprocessingCanvas" xmlns:cx="http://schemas.microsoft.com/office/drawing/2014/chartex" xmlns:cx1="http://schemas.microsoft.com/office/drawing/2015/9/8/chartex" xmlns:cx2="http://schemas.microsoft.com/office/drawing/2015/10/21/chartex" xmlns:cx3="http://schemas.microsoft.com/office/drawing/2016/5/9/chartex" xmlns:cx4="http://schemas.microsoft.com/office/drawing/2016/5/10/chartex" xmlns:cx5="http://schemas.microsoft.com/office/drawing/2016/5/11/chartex" xmlns:cx6="http://schemas.microsoft.com/office/drawing/2016/5/12/chartex" xmlns:cx7="http://schemas.microsoft.com/office/drawing/2016/5/13/chartex" xmlns:cx8="http://schemas.microsoft.com/office/drawing/2016/5/14/chartex" xmlns:mc="http://schemas.openxmlformats.org/markup-compatibility/2006" xmlns:aink="http://schemas.microsoft.com/office/drawing/2016/ink" xmlns:am3d="http://schemas.microsoft.com/office/drawing/2017/model3d" xmlns:o="urn:schemas-microsoft-com:office:office" xmlns:oel="http://schemas.microsoft.com/office/2019/extlst" xmlns:r="http://schemas.openxmlformats.org/officeDocument/2006/relationships" xmlns:m="http://schemas.openxmlformats.org/officeDocument/2006/math" xmlns:v="urn:schemas-microsoft-com:vml" xmlns:wp14="http://schemas.microsoft.com/office/word/2010/wordprocessingDrawing" xmlns:wp="http://schemas.openxmlformats.org/drawingml/2006/wordprocessingDrawing" xmlns:w10="urn:schemas-microsoft-com:office:word" xmlns:w="http://schemas.openxmlformats.org/wordprocessingml/2006/main" xmlns:w14="http://schemas.microsoft.com/office/word/2010/wordml" xmlns:w15="http://schemas.microsoft.com/office/word/2012/wordml" xmlns:w16cex="http://schemas.microsoft.com/office/word/2018/wordml/cex" xmlns:w16cid="http://schemas.microsoft.com/office/word/2016/wordml/cid" xmlns:w16="http://schemas.microsoft.com/office/word/2018/wordml" xmlns:w16du="http://schemas.microsoft.com/office/word/2023/wordml/word16du" xmlns:w16sdtdh="http://schemas.microsoft.com/office/word/2020/wordml/sdtdatahash" xmlns:w16se="http://schemas.microsoft.com/office/word/2015/wordml/symex" xmlns:wpg="http://schemas.microsoft.com/office/word/2010/wordprocessingGroup" xmlns:wpi="http://schemas.microsoft.com/office/word/2010/wordprocessingInk" xmlns:wne="http://schemas.microsoft.com/office/word/2006/wordml" xmlns:wps="http://schemas.microsoft.com/office/word/2010/wordprocessingShape" mc:Ignorable="w14 w15 w16se w16cid w16 w16cex w16sdtdh w16du wp14">
+<w:hdr xmlns:wpc="http://schemas.microsoft.com/office/word/2010/wordprocessingCanvas" xmlns:cx="http://schemas.microsoft.com/office/drawing/2014/chartex" xmlns:cx1="http://schemas.microsoft.com/office/drawing/2015/9/8/chartex" xmlns:cx2="http://schemas.microsoft.com/office/drawing/2015/10/21/chartex" xmlns:cx3="http://schemas.microsoft.com/office/drawing/2016/5/9/chartex" xmlns:cx4="http://schemas.microsoft.com/office/drawing/2016/5/10/chartex" xmlns:cx5="http://schemas.microsoft.com/office/drawing/2016/5/11/chartex" xmlns:cx6="http://schemas.microsoft.com/office/drawing/2016/5/12/chartex" xmlns:cx7="http://schemas.microsoft.com/office/drawing/2016/5/13/chartex" xmlns:cx8="http://schemas.microsoft.com/office/drawing/2016/5/14/chartex" xmlns:mc="http://schemas.openxmlformats.org/markup-compatibility/2006" xmlns:aink="http://schemas.microsoft.com/office/drawing/2016/ink" xmlns:am3d="http://schemas.microsoft.com/office/drawing/2017/model3d" xmlns:o="urn:schemas-microsoft-com:office:office" xmlns:oel="http://schemas.microsoft.com/office/2019/extlst" xmlns:r="http://schemas.openxmlformats.org/officeDocument/2006/relationships" xmlns:m="http://schemas.openxmlformats.org/officeDocument/2006/math" xmlns:v="urn:schemas-microsoft-com:vml" xmlns:wp14="http://schemas.microsoft.com/office/word/2010/wordprocessingDrawing" xmlns:wp="http://schemas.openxmlformats.org/drawingml/2006/wordprocessingDrawing" xmlns:w10="urn:schemas-microsoft-com:office:word" xmlns:w="http://schemas.openxmlformats.org/wordprocessingml/2006/main" xmlns:w14="http://schemas.microsoft.com/office/word/2010/wordml" xmlns:w15="http://schemas.microsoft.com/office/word/2012/wordml" xmlns:w16cex="http://schemas.microsoft.com/office/word/2018/wordml/cex" xmlns:w16cid="http://schemas.microsoft.com/office/word/2016/wordml/cid" xmlns:w16="http://schemas.microsoft.com/office/word/2018/wordml" xmlns:w16du="http://schemas.microsoft.com/office/word/2023/wordml/word16du" xmlns:w16sdtdh="http://schemas.microsoft.com/office/word/2020/wordml/sdtdatahash" xmlns:w16sdtfl="http://schemas.microsoft.com/office/word/2024/wordml/sdtformatlock" xmlns:w16se="http://schemas.microsoft.com/office/word/2015/wordml/symex" xmlns:wpg="http://schemas.microsoft.com/office/word/2010/wordprocessingGroup" xmlns:wpi="http://schemas.microsoft.com/office/word/2010/wordprocessingInk" xmlns:wne="http://schemas.microsoft.com/office/word/2006/wordml" xmlns:wps="http://schemas.microsoft.com/office/word/2010/wordprocessingShape" mc:Ignorable="w14 w15 w16se w16cid w16 w16cex w16sdtdh w16sdtfl w16du wp14">
+  <w:p>
+    <w:pPr>
+      <w:jc w:val="center"/>
+      <w:rPr>
+        <w:rFonts w:ascii="Bookman Old Style" w:eastAsia="Arial Unicode MS" w:hAnsi="Bookman Old Style"/>
+        <w:b/>
+        <w:sz w:val="26"/>
+        <w:szCs w:val="26"/>
+        <w:lang w:val="id-ID"/>
+      </w:rPr>
+    </w:pPr>
+    <w:r>
+      <w:rPr>
+        <w:rFonts w:ascii="Bookman Old Style" w:eastAsia="Arial Unicode MS" w:hAnsi="Bookman Old Style"/>
+        <w:b/>
+        <w:noProof/>
+        <w:sz w:val="26"/>
+        <w:szCs w:val="26"/>
+        <w:lang w:bidi="ar-SA"/>
+      </w:rPr>
+      <w:drawing>
+        <wp:anchor distT="0" distB="0" distL="114300" distR="114300" simplePos="0" relativeHeight="251663360" behindDoc="0" locked="0" layoutInCell="1" allowOverlap="1" wp14:anchorId="2E415D8B" wp14:editId="1CAE62F5">
+          <wp:simplePos x="0" y="0"/>
+          <wp:positionH relativeFrom="margin">
+            <wp:posOffset>-104775</wp:posOffset>
+          </wp:positionH>
+          <wp:positionV relativeFrom="page">
+            <wp:posOffset>374650</wp:posOffset>
+          </wp:positionV>
+          <wp:extent cx="615950" cy="793750"/>
+          <wp:effectExtent l="19050" t="0" r="0" b="0"/>
+          <wp:wrapNone/>
+          <wp:docPr id="791334270" name="Picture 1" descr="A black and white logo&#10;&#10;Description automatically generated"/>
+          <wp:cNvGraphicFramePr>
+            <a:graphicFrameLocks xmlns:a="http://schemas.openxmlformats.org/drawingml/2006/main" noChangeAspect="1"/>
+          </wp:cNvGraphicFramePr>
+          <a:graphic xmlns:a="http://schemas.openxmlformats.org/drawingml/2006/main">
+            <a:graphicData uri="http://schemas.openxmlformats.org/drawingml/2006/picture">
+              <pic:pic xmlns:pic="http://schemas.openxmlformats.org/drawingml/2006/picture">
+                <pic:nvPicPr>
+                  <pic:cNvPr id="148447939" name="Picture 1" descr="A black and white logo&#10;&#10;Description automatically generated"/>
+                  <pic:cNvPicPr/>
+                </pic:nvPicPr>
+                <pic:blipFill>
+                  <a:blip r:embed="rId1" cstate="print">
+                    <a:extLst>
+                      <a:ext uri="{28A0092B-C50C-407E-A947-70E740481C1C}">
+                        <a14:useLocalDpi xmlns:a14="http://schemas.microsoft.com/office/drawing/2010/main" val="0"/>
+                      </a:ext>
+                    </a:extLst>
+                  </a:blip>
+                  <a:stretch>
+                    <a:fillRect/>
+                  </a:stretch>
+                </pic:blipFill>
+                <pic:spPr>
+                  <a:xfrm>
+                    <a:off x="0" y="0"/>
+                    <a:ext cx="615950" cy="793750"/>
+                  </a:xfrm>
+                  <a:prstGeom prst="rect">
+                    <a:avLst/>
+                  </a:prstGeom>
+                </pic:spPr>
+              </pic:pic>
+            </a:graphicData>
+          </a:graphic>
+        </wp:anchor>
+      </w:drawing>
+    </w:r>
+    <w:r>
+      <w:rPr>
+        <w:rFonts w:ascii="Bookman Old Style" w:eastAsia="Arial Unicode MS" w:hAnsi="Bookman Old Style"/>
+        <w:b/>
+        <w:sz w:val="26"/>
+        <w:szCs w:val="26"/>
+        <w:lang w:val="id-ID"/>
+      </w:rPr>
+      <w:t>MAHKAMAH AGUNG REPUBLIK INDONESIA</w:t>
+    </w:r>
+  </w:p>
+  <w:p>
+    <w:pPr>
+      <w:jc w:val="center"/>
+      <w:rPr>
+        <w:rFonts w:ascii="Bookman Old Style" w:eastAsia="Arial Unicode MS" w:hAnsi="Bookman Old Style"/>
+        <w:b/>
+        <w:sz w:val="26"/>
+        <w:szCs w:val="26"/>
+        <w:lang w:val="id-ID"/>
+      </w:rPr>
+    </w:pPr>
+    <w:r>
+      <w:rPr>
+        <w:rFonts w:ascii="Bookman Old Style" w:eastAsia="Arial Unicode MS" w:hAnsi="Bookman Old Style"/>
+        <w:b/>
+        <w:sz w:val="26"/>
+        <w:szCs w:val="26"/>
+        <w:lang w:val="id-ID"/>
+      </w:rPr>
+      <w:t>DIREKTORAT JENDERAL BADAN PERADILAN UMUM</w:t>
+    </w:r>
+  </w:p>
+  <w:p>
+    <w:pPr>
+      <w:jc w:val="center"/>
+      <w:rPr>
+        <w:rFonts w:ascii="Bookman Old Style" w:eastAsia="Arial Unicode MS" w:hAnsi="Bookman Old Style"/>
+        <w:b/>
+        <w:sz w:val="26"/>
+        <w:szCs w:val="26"/>
+        <w:lang w:val="en-ID"/>
+      </w:rPr>
+    </w:pPr>
+    <w:r>
+      <w:rPr>
+        <w:rFonts w:ascii="Bookman Old Style" w:eastAsia="Arial Unicode MS" w:hAnsi="Bookman Old Style"/>
+        <w:b/>
+        <w:sz w:val="26"/>
+        <w:szCs w:val="26"/>
+        <w:lang w:val="id-ID"/>
+      </w:rPr>
+      <w:t>PENGADILAN TING</w:t>
+    </w:r>
+    <w:r>
+      <w:rPr>
+        <w:rFonts w:ascii="Bookman Old Style" w:eastAsia="Arial Unicode MS" w:hAnsi="Bookman Old Style"/>
+        <w:b/>
+        <w:sz w:val="26"/>
+        <w:szCs w:val="26"/>
+        <w:lang w:val="en-ID"/>
+      </w:rPr>
+      <w:t>GI KEPULAUAN RIAU</w:t>
+    </w:r>
+  </w:p>
+  <w:p>
+    <w:pPr>
+      <w:jc w:val="center"/>
+      <w:rPr>
+        <w:rFonts w:ascii="Bookman Old Style" w:eastAsia="Arial Unicode MS" w:hAnsi="Bookman Old Style"/>
+        <w:b/>
+        <w:sz w:val="26"/>
+        <w:szCs w:val="26"/>
+        <w:lang w:val="en-ID"/>
+      </w:rPr>
+    </w:pPr>
+    <w:r>
+      <w:rPr>
+        <w:rFonts w:ascii="Bookman Old Style" w:eastAsia="Arial Unicode MS" w:hAnsi="Bookman Old Style"/>
+        <w:b/>
+        <w:sz w:val="26"/>
+        <w:szCs w:val="26"/>
+      </w:rPr>
+      <w:t xml:space="preserve">PENGADILAN NEGERI </w:t>
+    </w:r>
+    <w:r>
+      <w:rPr>
+        <w:rFonts w:ascii="Bookman Old Style" w:eastAsia="Arial Unicode MS" w:hAnsi="Bookman Old Style"/>
+        <w:b/>
+        <w:sz w:val="26"/>
+        <w:szCs w:val="26"/>
+        <w:lang w:val="en-ID"/>
+      </w:rPr>
+      <w:t>NATUNA</w:t>
+    </w:r>
+  </w:p>
+  <w:p>
+    <w:pPr>
+      <w:jc w:val="center"/>
+      <w:rPr>
+        <w:rFonts w:ascii="Bookman Old Style" w:hAnsi="Bookman Old Style"/>
+        <w:sz w:val="16"/>
+        <w:szCs w:val="16"/>
+        <w:lang w:val="en-ID"/>
+      </w:rPr>
+    </w:pPr>
+    <w:r>
+      <w:rPr>
+        <w:rFonts w:ascii="Bookman Old Style" w:hAnsi="Bookman Old Style"/>
+        <w:sz w:val="16"/>
+        <w:szCs w:val="16"/>
+        <w:lang w:val="en-ID"/>
+      </w:rPr>
+      <w:t xml:space="preserve">Jalan Batu Sisir, Sungai Ulu, </w:t>
+    </w:r>
+    <w:proofErr w:type="spellStart"/>
+    <w:r>
+      <w:rPr>
+        <w:rFonts w:ascii="Bookman Old Style" w:hAnsi="Bookman Old Style"/>
+        <w:sz w:val="16"/>
+        <w:szCs w:val="16"/>
+        <w:lang w:val="en-ID"/>
+      </w:rPr>
+      <w:t>Kecamatan</w:t>
+    </w:r>
+    <w:proofErr w:type="spellEnd"/>
+    <w:r>
+      <w:rPr>
+        <w:rFonts w:ascii="Bookman Old Style" w:hAnsi="Bookman Old Style"/>
+        <w:sz w:val="16"/>
+        <w:szCs w:val="16"/>
+        <w:lang w:val="en-ID"/>
+      </w:rPr>
+      <w:t xml:space="preserve"> </w:t>
+    </w:r>
+    <w:proofErr w:type="spellStart"/>
+    <w:r>
+      <w:rPr>
+        <w:rFonts w:ascii="Bookman Old Style" w:hAnsi="Bookman Old Style"/>
+        <w:sz w:val="16"/>
+        <w:szCs w:val="16"/>
+        <w:lang w:val="en-ID"/>
+      </w:rPr>
+      <w:t>Bunguran</w:t>
+    </w:r>
+    <w:proofErr w:type="spellEnd"/>
+    <w:r>
+      <w:rPr>
+        <w:rFonts w:ascii="Bookman Old Style" w:hAnsi="Bookman Old Style"/>
+        <w:sz w:val="16"/>
+        <w:szCs w:val="16"/>
+        <w:lang w:val="en-ID"/>
+      </w:rPr>
+      <w:t xml:space="preserve"> Timur, </w:t>
+    </w:r>
+    <w:proofErr w:type="spellStart"/>
+    <w:r>
+      <w:rPr>
+        <w:rFonts w:ascii="Bookman Old Style" w:hAnsi="Bookman Old Style"/>
+        <w:sz w:val="16"/>
+        <w:szCs w:val="16"/>
+        <w:lang w:val="en-ID"/>
+      </w:rPr>
+      <w:t>Kabupaten</w:t>
+    </w:r>
+    <w:proofErr w:type="spellEnd"/>
+    <w:r>
+      <w:rPr>
+        <w:rFonts w:ascii="Bookman Old Style" w:hAnsi="Bookman Old Style"/>
+        <w:sz w:val="16"/>
+        <w:szCs w:val="16"/>
+        <w:lang w:val="en-ID"/>
+      </w:rPr>
+      <w:t xml:space="preserve"> Natuna</w:t>
+    </w:r>
+  </w:p>
+  <w:p>
+    <w:pPr>
+      <w:jc w:val="center"/>
+      <w:rPr>
+        <w:rFonts w:ascii="Bookman Old Style" w:hAnsi="Bookman Old Style"/>
+        <w:sz w:val="16"/>
+        <w:szCs w:val="16"/>
+        <w:lang w:val="en-ID"/>
+      </w:rPr>
+    </w:pPr>
+    <w:r>
+      <w:rPr>
+        <w:rFonts w:ascii="Bookman Old Style" w:hAnsi="Bookman Old Style"/>
+        <w:noProof/>
+        <w:sz w:val="16"/>
+        <w:szCs w:val="16"/>
+        <w:lang w:val="en-ID"/>
+      </w:rPr>
+      <mc:AlternateContent>
+        <mc:Choice Requires="wps">
+          <w:drawing>
+            <wp:anchor distT="4294967295" distB="4294967295" distL="114300" distR="114300" simplePos="0" relativeHeight="251662336" behindDoc="0" locked="0" layoutInCell="1" allowOverlap="1" wp14:anchorId="69171317" wp14:editId="35443B23">
+              <wp:simplePos x="0" y="0"/>
+              <wp:positionH relativeFrom="column">
+                <wp:posOffset>-157480</wp:posOffset>
+              </wp:positionH>
+              <wp:positionV relativeFrom="paragraph">
+                <wp:posOffset>151129</wp:posOffset>
+              </wp:positionV>
+              <wp:extent cx="6227445" cy="0"/>
+              <wp:effectExtent l="38100" t="38100" r="40005" b="76200"/>
+              <wp:wrapNone/>
+              <wp:docPr id="1963743519" name="Straight Connector 1"/>
+              <wp:cNvGraphicFramePr>
+                <a:graphicFrameLocks xmlns:a="http://schemas.openxmlformats.org/drawingml/2006/main"/>
+              </wp:cNvGraphicFramePr>
+              <a:graphic xmlns:a="http://schemas.openxmlformats.org/drawingml/2006/main">
+                <a:graphicData uri="http://schemas.microsoft.com/office/word/2010/wordprocessingShape">
+                  <wps:wsp>
+                    <wps:cNvCnPr>
+                      <a:cxnSpLocks/>
+                    </wps:cNvCnPr>
+                    <wps:spPr>
+                      <a:xfrm>
+                        <a:off x="0" y="0"/>
+                        <a:ext cx="6227445" cy="0"/>
+                      </a:xfrm>
+                      <a:prstGeom prst="line">
+                        <a:avLst/>
+                      </a:prstGeom>
+                      <a:ln w="19050"/>
+                    </wps:spPr>
+                    <wps:style>
+                      <a:lnRef idx="2">
+                        <a:schemeClr val="dk1"/>
+                      </a:lnRef>
+                      <a:fillRef idx="0">
+                        <a:schemeClr val="dk1"/>
+                      </a:fillRef>
+                      <a:effectRef idx="1">
+                        <a:schemeClr val="dk1"/>
+                      </a:effectRef>
+                      <a:fontRef idx="minor">
+                        <a:schemeClr val="tx1"/>
+                      </a:fontRef>
+                    </wps:style>
+                    <wps:bodyPr/>
+                  </wps:wsp>
+                </a:graphicData>
+              </a:graphic>
+              <wp14:sizeRelH relativeFrom="margin">
+                <wp14:pctWidth>0</wp14:pctWidth>
+              </wp14:sizeRelH>
+              <wp14:sizeRelV relativeFrom="margin">
+                <wp14:pctHeight>0</wp14:pctHeight>
+              </wp14:sizeRelV>
+            </wp:anchor>
+          </w:drawing>
+        </mc:Choice>
+        <mc:Fallback>
+          <w:pict>
+            <v:line w14:anchorId="5A6533EB" id="Straight Connector 1" o:spid="_x0000_s1026" style="position:absolute;z-index:251662336;visibility:visible;mso-wrap-style:square;mso-width-percent:0;mso-height-percent:0;mso-wrap-distance-left:9pt;mso-wrap-distance-top:-3e-5mm;mso-wrap-distance-right:9pt;mso-wrap-distance-bottom:-3e-5mm;mso-position-horizontal:absolute;mso-position-horizontal-relative:text;mso-position-vertical:absolute;mso-position-vertical-relative:text;mso-width-percent:0;mso-height-percent:0;mso-width-relative:margin;mso-height-relative:margin" from="-12.4pt,11.9pt" to="477.95pt,11.9pt" o:gfxdata="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" strokecolor="black [3200]" strokeweight="1.5pt">
+              <v:shadow on="t" color="black" opacity="24903f" origin=",.5" offset="0,.55556mm"/>
+              <o:lock v:ext="edit" shapetype="f"/>
+            </v:line>
+          </w:pict>
+        </mc:Fallback>
+      </mc:AlternateContent>
+    </w:r>
+    <w:proofErr w:type="spellStart"/>
+    <w:r>
+      <w:rPr>
+        <w:rFonts w:ascii="Bookman Old Style" w:hAnsi="Bookman Old Style"/>
+        <w:sz w:val="16"/>
+        <w:szCs w:val="16"/>
+        <w:lang w:val="en-ID"/>
+      </w:rPr>
+      <w:t>Provinsi</w:t>
+    </w:r>
+    <w:proofErr w:type="spellEnd"/>
+    <w:r>
+      <w:rPr>
+        <w:rFonts w:ascii="Bookman Old Style" w:hAnsi="Bookman Old Style"/>
+        <w:sz w:val="16"/>
+        <w:szCs w:val="16"/>
+        <w:lang w:val="en-ID"/>
+      </w:rPr>
+      <w:t xml:space="preserve"> </w:t>
+    </w:r>
+    <w:proofErr w:type="spellStart"/>
+    <w:r>
+      <w:rPr>
+        <w:rFonts w:ascii="Bookman Old Style" w:hAnsi="Bookman Old Style"/>
+        <w:sz w:val="16"/>
+        <w:szCs w:val="16"/>
+        <w:lang w:val="en-ID"/>
+      </w:rPr>
+      <w:t>Kepulauan</w:t>
+    </w:r>
+    <w:proofErr w:type="spellEnd"/>
+    <w:r>
+      <w:rPr>
+        <w:rFonts w:ascii="Bookman Old Style" w:hAnsi="Bookman Old Style"/>
+        <w:sz w:val="16"/>
+        <w:szCs w:val="16"/>
+        <w:lang w:val="en-ID"/>
+      </w:rPr>
+      <w:t xml:space="preserve"> Riau 29777. </w:t>
+    </w:r>
+    <w:hyperlink r:id="rId2" w:history="1">
+      <w:r>
+        <w:rPr>
+          <w:rStyle w:val="Hyperlink"/>
+          <w:rFonts w:ascii="Bookman Old Style" w:hAnsi="Bookman Old Style"/>
+          <w:color w:val="auto"/>
+          <w:sz w:val="16"/>
+          <w:szCs w:val="16"/>
+          <w:lang w:val="en-ID"/>
+        </w:rPr>
+        <w:t>www.pn-natuna.go.id</w:t>
+      </w:r>
+    </w:hyperlink>
+    <w:r>
+      <w:rPr>
+        <w:rFonts w:ascii="Bookman Old Style" w:hAnsi="Bookman Old Style"/>
+        <w:sz w:val="16"/>
+        <w:szCs w:val="16"/>
+        <w:lang w:val="en-ID"/>
+      </w:rPr>
+      <w:t xml:space="preserve">, </w:t>
+    </w:r>
+    <w:hyperlink r:id="rId3" w:history="1">
+      <w:r>
+        <w:rPr>
+          <w:rStyle w:val="Hyperlink"/>
+          <w:rFonts w:ascii="Bookman Old Style" w:hAnsi="Bookman Old Style"/>
+          <w:color w:val="auto"/>
+          <w:sz w:val="16"/>
+          <w:szCs w:val="16"/>
+          <w:lang w:val="en-ID"/>
+        </w:rPr>
+        <w:t>pn.natuna@gmail.com</w:t>
+      </w:r>
+    </w:hyperlink>
+    <w:r>
+      <w:rPr>
+        <w:rFonts w:ascii="Bookman Old Style" w:hAnsi="Bookman Old Style"/>
+        <w:sz w:val="16"/>
+        <w:szCs w:val="16"/>
+        <w:lang w:val="en-ID"/>
+      </w:rPr>
+      <w:t xml:space="preserve"> </w:t>
+    </w:r>
+  </w:p>
+  <w:p>
+    <w:pPr>
+      <w:pStyle w:val="Header"/>
+      <w:rPr>
+        <w:lang w:val="en-ID"/>
+      </w:rPr>
+    </w:pPr>
+  </w:p>
+</w:hdr>
+</file>
+
+<file path=word/header2.xml><?xml version="1.0" encoding="utf-8"?>
+<w:hdr xmlns:wpc="http://schemas.microsoft.com/office/word/2010/wordprocessingCanvas" xmlns:cx="http://schemas.microsoft.com/office/drawing/2014/chartex" xmlns:cx1="http://schemas.microsoft.com/office/drawing/2015/9/8/chartex" xmlns:cx2="http://schemas.microsoft.com/office/drawing/2015/10/21/chartex" xmlns:cx3="http://schemas.microsoft.com/office/drawing/2016/5/9/chartex" xmlns:cx4="http://schemas.microsoft.com/office/drawing/2016/5/10/chartex" xmlns:cx5="http://schemas.microsoft.com/office/drawing/2016/5/11/chartex" xmlns:cx6="http://schemas.microsoft.com/office/drawing/2016/5/12/chartex" xmlns:cx7="http://schemas.microsoft.com/office/drawing/2016/5/13/chartex" xmlns:cx8="http://schemas.microsoft.com/office/drawing/2016/5/14/chartex" xmlns:mc="http://schemas.openxmlformats.org/markup-compatibility/2006" xmlns:aink="http://schemas.microsoft.com/office/drawing/2016/ink" xmlns:am3d="http://schemas.microsoft.com/office/drawing/2017/model3d" xmlns:o="urn:schemas-microsoft-com:office:office" xmlns:oel="http://schemas.microsoft.com/office/2019/extlst" xmlns:r="http://schemas.openxmlformats.org/officeDocument/2006/relationships" xmlns:m="http://schemas.openxmlformats.org/officeDocument/2006/math" xmlns:v="urn:schemas-microsoft-com:vml" xmlns:wp14="http://schemas.microsoft.com/office/word/2010/wordprocessingDrawing" xmlns:wp="http://schemas.openxmlformats.org/drawingml/2006/wordprocessingDrawing" xmlns:w10="urn:schemas-microsoft-com:office:word" xmlns:w="http://schemas.openxmlformats.org/wordprocessingml/2006/main" xmlns:w14="http://schemas.microsoft.com/office/word/2010/wordml" xmlns:w15="http://schemas.microsoft.com/office/word/2012/wordml" xmlns:w16cex="http://schemas.microsoft.com/office/word/2018/wordml/cex" xmlns:w16cid="http://schemas.microsoft.com/office/word/2016/wordml/cid" xmlns:w16="http://schemas.microsoft.com/office/word/2018/wordml" xmlns:w16du="http://schemas.microsoft.com/office/word/2023/wordml/word16du" xmlns:w16sdtdh="http://schemas.microsoft.com/office/word/2020/wordml/sdtdatahash" xmlns:w16sdtfl="http://schemas.microsoft.com/office/word/2024/wordml/sdtformatlock" xmlns:w16se="http://schemas.microsoft.com/office/word/2015/wordml/symex" xmlns:wpg="http://schemas.microsoft.com/office/word/2010/wordprocessingGroup" xmlns:wpi="http://schemas.microsoft.com/office/word/2010/wordprocessingInk" xmlns:wne="http://schemas.microsoft.com/office/word/2006/wordml" xmlns:wps="http://schemas.microsoft.com/office/word/2010/wordprocessingShape" mc:Ignorable="w14 w15 w16se w16cid w16 w16cex w16sdtdh w16sdtfl w16du wp14">
   <w:p>
     <w:pPr>
       <w:jc w:val="center"/>
@@ -2517,7 +2996,67 @@
         <w:szCs w:val="16"/>
         <w:lang w:val="en-ID"/>
       </w:rPr>
-      <w:t>Jalan Batu Sisir, Sungai Ulu, Kecamatan Bunguran Timur, Kabupaten Natuna</w:t>
+      <w:t xml:space="preserve">Jalan Batu Sisir, Sungai Ulu, </w:t>
+    </w:r>
+    <w:proofErr w:type="spellStart"/>
+    <w:r>
+      <w:rPr>
+        <w:rFonts w:ascii="Bookman Old Style" w:hAnsi="Bookman Old Style"/>
+        <w:sz w:val="16"/>
+        <w:szCs w:val="16"/>
+        <w:lang w:val="en-ID"/>
+      </w:rPr>
+      <w:t>Kecamatan</w:t>
+    </w:r>
+    <w:proofErr w:type="spellEnd"/>
+    <w:r>
+      <w:rPr>
+        <w:rFonts w:ascii="Bookman Old Style" w:hAnsi="Bookman Old Style"/>
+        <w:sz w:val="16"/>
+        <w:szCs w:val="16"/>
+        <w:lang w:val="en-ID"/>
+      </w:rPr>
+      <w:t xml:space="preserve"> </w:t>
+    </w:r>
+    <w:proofErr w:type="spellStart"/>
+    <w:r>
+      <w:rPr>
+        <w:rFonts w:ascii="Bookman Old Style" w:hAnsi="Bookman Old Style"/>
+        <w:sz w:val="16"/>
+        <w:szCs w:val="16"/>
+        <w:lang w:val="en-ID"/>
+      </w:rPr>
+      <w:t>Bunguran</w:t>
+    </w:r>
+    <w:proofErr w:type="spellEnd"/>
+    <w:r>
+      <w:rPr>
+        <w:rFonts w:ascii="Bookman Old Style" w:hAnsi="Bookman Old Style"/>
+        <w:sz w:val="16"/>
+        <w:szCs w:val="16"/>
+        <w:lang w:val="en-ID"/>
+      </w:rPr>
+      <w:t xml:space="preserve"> Timur, </w:t>
+    </w:r>
+    <w:proofErr w:type="spellStart"/>
+    <w:r>
+      <w:rPr>
+        <w:rFonts w:ascii="Bookman Old Style" w:hAnsi="Bookman Old Style"/>
+        <w:sz w:val="16"/>
+        <w:szCs w:val="16"/>
+        <w:lang w:val="en-ID"/>
+      </w:rPr>
+      <w:t>Kabupaten</w:t>
+    </w:r>
+    <w:proofErr w:type="spellEnd"/>
+    <w:r>
+      <w:rPr>
+        <w:rFonts w:ascii="Bookman Old Style" w:hAnsi="Bookman Old Style"/>
+        <w:sz w:val="16"/>
+        <w:szCs w:val="16"/>
+        <w:lang w:val="en-ID"/>
+      </w:rPr>
+      <w:t xml:space="preserve"> Natuna</w:t>
     </w:r>
   </w:p>
   <w:p>
@@ -2599,7 +3138,7 @@
             </wp:anchor>
           </w:drawing>
         </mc:Choice>
-        <mc:Fallback xmlns:w16sdtfl="http://schemas.microsoft.com/office/word/2024/wordml/sdtformatlock">
+        <mc:Fallback>
           <w:pict>
             <v:line w14:anchorId="278AD4F6" id="Straight Connector 1" o:spid="_x0000_s1026" style="position:absolute;z-index:251658240;visibility:visible;mso-wrap-style:square;mso-width-percent:0;mso-height-percent:0;mso-wrap-distance-left:9pt;mso-wrap-distance-top:-3e-5mm;mso-wrap-distance-right:9pt;mso-wrap-distance-bottom:-3e-5mm;mso-position-horizontal:absolute;mso-position-horizontal-relative:text;mso-position-vertical:absolute;mso-position-vertical-relative:text;mso-width-percent:0;mso-height-percent:0;mso-width-relative:margin;mso-height-relative:margin" from="-12.4pt,11.9pt" to="477.95pt,11.9pt" o:gfxdata="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" strokecolor="black [3200]" strokeweight="1.5pt">
               <v:shadow on="t" color="black" opacity="24903f" origin=",.5" offset="0,.55556mm"/>
@@ -2609,6 +3148,7 @@
         </mc:Fallback>
       </mc:AlternateContent>
     </w:r>
+    <w:proofErr w:type="spellStart"/>
     <w:r>
       <w:rPr>
         <w:rFonts w:ascii="Bookman Old Style" w:hAnsi="Bookman Old Style"/>
@@ -2616,7 +3156,37 @@
         <w:szCs w:val="16"/>
         <w:lang w:val="en-ID"/>
       </w:rPr>
-      <w:t xml:space="preserve">Provinsi Kepulauan Riau 29777. </w:t>
+      <w:t>Provinsi</w:t>
+    </w:r>
+    <w:proofErr w:type="spellEnd"/>
+    <w:r>
+      <w:rPr>
+        <w:rFonts w:ascii="Bookman Old Style" w:hAnsi="Bookman Old Style"/>
+        <w:sz w:val="16"/>
+        <w:szCs w:val="16"/>
+        <w:lang w:val="en-ID"/>
+      </w:rPr>
+      <w:t xml:space="preserve"> </w:t>
+    </w:r>
+    <w:proofErr w:type="spellStart"/>
+    <w:r>
+      <w:rPr>
+        <w:rFonts w:ascii="Bookman Old Style" w:hAnsi="Bookman Old Style"/>
+        <w:sz w:val="16"/>
+        <w:szCs w:val="16"/>
+        <w:lang w:val="en-ID"/>
+      </w:rPr>
+      <w:t>Kepulauan</w:t>
+    </w:r>
+    <w:proofErr w:type="spellEnd"/>
+    <w:r>
+      <w:rPr>
+        <w:rFonts w:ascii="Bookman Old Style" w:hAnsi="Bookman Old Style"/>
+        <w:sz w:val="16"/>
+        <w:szCs w:val="16"/>
+        <w:lang w:val="en-ID"/>
+      </w:rPr>
+      <w:t xml:space="preserve"> Riau 29777. </w:t>
     </w:r>
     <w:hyperlink r:id="rId2" w:history="1">
       <w:r>
@@ -2667,7 +3237,7 @@
 </file>
 
 <file path=word/numbering.xml><?xml version="1.0" encoding="utf-8"?>
-<w:numbering xmlns:wpc="http://schemas.microsoft.com/office/word/2010/wordprocessingCanvas" xmlns:cx="http://schemas.microsoft.com/office/drawing/2014/chartex" xmlns:cx1="http://schemas.microsoft.com/office/drawing/2015/9/8/chartex" xmlns:cx2="http://schemas.microsoft.com/office/drawing/2015/10/21/chartex" xmlns:cx3="http://schemas.microsoft.com/office/drawing/2016/5/9/chartex" xmlns:cx4="http://schemas.microsoft.com/office/drawing/2016/5/10/chartex" xmlns:cx5="http://schemas.microsoft.com/office/drawing/2016/5/11/chartex" xmlns:cx6="http://schemas.microsoft.com/office/drawing/2016/5/12/chartex" xmlns:cx7="http://schemas.microsoft.com/office/drawing/2016/5/13/chartex" xmlns:cx8="http://schemas.microsoft.com/office/drawing/2016/5/14/chartex" xmlns:mc="http://schemas.openxmlformats.org/markup-compatibility/2006" xmlns:aink="http://schemas.microsoft.com/office/drawing/2016/ink" xmlns:am3d="http://schemas.microsoft.com/office/drawing/2017/model3d" xmlns:o="urn:schemas-microsoft-com:office:office" xmlns:oel="http://schemas.microsoft.com/office/2019/extlst" xmlns:r="http://schemas.openxmlformats.org/officeDocument/2006/relationships" xmlns:m="http://schemas.openxmlformats.org/officeDocument/2006/math" xmlns:v="urn:schemas-microsoft-com:vml" xmlns:wp14="http://schemas.microsoft.com/office/word/2010/wordprocessingDrawing" xmlns:wp="http://schemas.openxmlformats.org/drawingml/2006/wordprocessingDrawing" xmlns:w10="urn:schemas-microsoft-com:office:word" xmlns:w="http://schemas.openxmlformats.org/wordprocessingml/2006/main" xmlns:w14="http://schemas.microsoft.com/office/word/2010/wordml" xmlns:w15="http://schemas.microsoft.com/office/word/2012/wordml" xmlns:w16cex="http://schemas.microsoft.com/office/word/2018/wordml/cex" xmlns:w16cid="http://schemas.microsoft.com/office/word/2016/wordml/cid" xmlns:w16="http://schemas.microsoft.com/office/word/2018/wordml" xmlns:w16du="http://schemas.microsoft.com/office/word/2023/wordml/word16du" xmlns:w16sdtdh="http://schemas.microsoft.com/office/word/2020/wordml/sdtdatahash" xmlns:w16se="http://schemas.microsoft.com/office/word/2015/wordml/symex" xmlns:wpg="http://schemas.microsoft.com/office/word/2010/wordprocessingGroup" xmlns:wpi="http://schemas.microsoft.com/office/word/2010/wordprocessingInk" xmlns:wne="http://schemas.microsoft.com/office/word/2006/wordml" xmlns:wps="http://schemas.microsoft.com/office/word/2010/wordprocessingShape" mc:Ignorable="w14 w15 w16se w16cid w16 w16cex w16sdtdh w16du wp14">
+<w:numbering xmlns:wpc="http://schemas.microsoft.com/office/word/2010/wordprocessingCanvas" xmlns:cx="http://schemas.microsoft.com/office/drawing/2014/chartex" xmlns:cx1="http://schemas.microsoft.com/office/drawing/2015/9/8/chartex" xmlns:cx2="http://schemas.microsoft.com/office/drawing/2015/10/21/chartex" xmlns:cx3="http://schemas.microsoft.com/office/drawing/2016/5/9/chartex" xmlns:cx4="http://schemas.microsoft.com/office/drawing/2016/5/10/chartex" xmlns:cx5="http://schemas.microsoft.com/office/drawing/2016/5/11/chartex" xmlns:cx6="http://schemas.microsoft.com/office/drawing/2016/5/12/chartex" xmlns:cx7="http://schemas.microsoft.com/office/drawing/2016/5/13/chartex" xmlns:cx8="http://schemas.microsoft.com/office/drawing/2016/5/14/chartex" xmlns:mc="http://schemas.openxmlformats.org/markup-compatibility/2006" xmlns:aink="http://schemas.microsoft.com/office/drawing/2016/ink" xmlns:am3d="http://schemas.microsoft.com/office/drawing/2017/model3d" xmlns:o="urn:schemas-microsoft-com:office:office" xmlns:oel="http://schemas.microsoft.com/office/2019/extlst" xmlns:r="http://schemas.openxmlformats.org/officeDocument/2006/relationships" xmlns:m="http://schemas.openxmlformats.org/officeDocument/2006/math" xmlns:v="urn:schemas-microsoft-com:vml" xmlns:wp14="http://schemas.microsoft.com/office/word/2010/wordprocessingDrawing" xmlns:wp="http://schemas.openxmlformats.org/drawingml/2006/wordprocessingDrawing" xmlns:w10="urn:schemas-microsoft-com:office:word" xmlns:w="http://schemas.openxmlformats.org/wordprocessingml/2006/main" xmlns:w14="http://schemas.microsoft.com/office/word/2010/wordml" xmlns:w15="http://schemas.microsoft.com/office/word/2012/wordml" xmlns:w16cex="http://schemas.microsoft.com/office/word/2018/wordml/cex" xmlns:w16cid="http://schemas.microsoft.com/office/word/2016/wordml/cid" xmlns:w16="http://schemas.microsoft.com/office/word/2018/wordml" xmlns:w16du="http://schemas.microsoft.com/office/word/2023/wordml/word16du" xmlns:w16sdtdh="http://schemas.microsoft.com/office/word/2020/wordml/sdtdatahash" xmlns:w16sdtfl="http://schemas.microsoft.com/office/word/2024/wordml/sdtformatlock" xmlns:w16se="http://schemas.microsoft.com/office/word/2015/wordml/symex" xmlns:wpg="http://schemas.microsoft.com/office/word/2010/wordprocessingGroup" xmlns:wpi="http://schemas.microsoft.com/office/word/2010/wordprocessingInk" xmlns:wne="http://schemas.microsoft.com/office/word/2006/wordml" xmlns:wps="http://schemas.microsoft.com/office/word/2010/wordprocessingShape" mc:Ignorable="w14 w15 w16se w16cid w16 w16cex w16sdtdh w16sdtfl w16du wp14">
   <w:abstractNum w:abstractNumId="0" w15:restartNumberingAfterBreak="0">
     <w:nsid w:val="1A782BB0"/>
     <w:multiLevelType w:val="hybridMultilevel"/>
@@ -3770,7 +4340,7 @@
 </file>
 
 <file path=word/styles.xml><?xml version="1.0" encoding="utf-8"?>
-<w:styles xmlns:mc="http://schemas.openxmlformats.org/markup-compatibility/2006" xmlns:r="http://schemas.openxmlformats.org/officeDocument/2006/relationships" xmlns:w="http://schemas.openxmlformats.org/wordprocessingml/2006/main" xmlns:w14="http://schemas.microsoft.com/office/word/2010/wordml" xmlns:w15="http://schemas.microsoft.com/office/word/2012/wordml" xmlns:w16cex="http://schemas.microsoft.com/office/word/2018/wordml/cex" xmlns:w16cid="http://schemas.microsoft.com/office/word/2016/wordml/cid" xmlns:w16="http://schemas.microsoft.com/office/word/2018/wordml" xmlns:w16du="http://schemas.microsoft.com/office/word/2023/wordml/word16du" xmlns:w16sdtdh="http://schemas.microsoft.com/office/word/2020/wordml/sdtdatahash" xmlns:w16se="http://schemas.microsoft.com/office/word/2015/wordml/symex" mc:Ignorable="w14 w15 w16se w16cid w16 w16cex w16sdtdh w16du">
+<w:styles xmlns:mc="http://schemas.openxmlformats.org/markup-compatibility/2006" xmlns:r="http://schemas.openxmlformats.org/officeDocument/2006/relationships" xmlns:w="http://schemas.openxmlformats.org/wordprocessingml/2006/main" xmlns:w14="http://schemas.microsoft.com/office/word/2010/wordml" xmlns:w15="http://schemas.microsoft.com/office/word/2012/wordml" xmlns:w16cex="http://schemas.microsoft.com/office/word/2018/wordml/cex" xmlns:w16cid="http://schemas.microsoft.com/office/word/2016/wordml/cid" xmlns:w16="http://schemas.microsoft.com/office/word/2018/wordml" xmlns:w16du="http://schemas.microsoft.com/office/word/2023/wordml/word16du" xmlns:w16sdtdh="http://schemas.microsoft.com/office/word/2020/wordml/sdtdatahash" xmlns:w16sdtfl="http://schemas.microsoft.com/office/word/2024/wordml/sdtformatlock" xmlns:w16se="http://schemas.microsoft.com/office/word/2015/wordml/symex" mc:Ignorable="w14 w15 w16se w16cid w16 w16cex w16sdtdh w16sdtfl w16du">
   <w:docDefaults>
     <w:rPrDefault>
       <w:rPr>

</xml_diff>